<commit_message>
feat: expand MD-102 courseware for five-day delivery
</commit_message>
<xml_diff>
--- a/courseware/LG-Microsoft Certified Endpoint Administrator Associate (MD-102).docx
+++ b/courseware/LG-Microsoft Certified Endpoint Administrator Associate (MD-102).docx
@@ -218,7 +218,7 @@
           <w:color w:val="1F6FEB"/>
           <w:sz w:val="24"/>
         </w:rPr>
-        <w:t>Version 3.0</w:t>
+        <w:t>Version 3.1</w:t>
       </w:r>
     </w:p>
     <w:p>
@@ -420,6 +420,64 @@
                 <w:sz w:val="19"/>
               </w:rPr>
               <w:t>Full technical rebuild aligned to the MD-102 skills measured 24 July 2026; added five-domain coverage, ten connected labs, Graph/PowerShell automation, Security Copilot, Intune Suite and evidence-led troubleshooting.</w:t>
+            </w:r>
+          </w:p>
+        </w:tc>
+        <w:tc>
+          <w:tcPr>
+            <w:tcW w:type="dxa" w:w="2498"/>
+          </w:tcPr>
+          <w:p>
+            <w:r/>
+            <w:r>
+              <w:rPr>
+                <w:sz w:val="19"/>
+              </w:rPr>
+              <w:t>Dr Alfred Ang</w:t>
+            </w:r>
+          </w:p>
+        </w:tc>
+      </w:tr>
+      <w:tr>
+        <w:tc>
+          <w:tcPr>
+            <w:tcW w:type="dxa" w:w="2498"/>
+          </w:tcPr>
+          <w:p>
+            <w:r/>
+            <w:r>
+              <w:rPr>
+                <w:sz w:val="19"/>
+              </w:rPr>
+              <w:t>3.1</w:t>
+            </w:r>
+          </w:p>
+        </w:tc>
+        <w:tc>
+          <w:tcPr>
+            <w:tcW w:type="dxa" w:w="2498"/>
+          </w:tcPr>
+          <w:p>
+            <w:r/>
+            <w:r>
+              <w:rPr>
+                <w:sz w:val="19"/>
+              </w:rPr>
+              <w:t>25 August 2026</w:t>
+            </w:r>
+          </w:p>
+        </w:tc>
+        <w:tc>
+          <w:tcPr>
+            <w:tcW w:type="dxa" w:w="2498"/>
+          </w:tcPr>
+          <w:p>
+            <w:r/>
+            <w:r>
+              <w:rPr>
+                <w:sz w:val="19"/>
+              </w:rPr>
+              <w:t>Expanded the five-day trainer deck beyond 550 slides with control-contract and diagnostic-trace deep dives for every objective; regenerated the slide map and Lesson Plan references.</w:t>
             </w:r>
           </w:p>
         </w:tc>

</xml_diff>